<commit_message>
docs: add the Destination Post Office Receipt and Delivery Route Assignment process and update the Central Sorting and Delivery Process
</commit_message>
<xml_diff>
--- a/01.WORKING_SPACE/1.TranNgocHuy-25410232/Phân loại & Chuyển phát trung tâm_v2.docx
+++ b/01.WORKING_SPACE/1.TranNgocHuy-25410232/Phân loại & Chuyển phát trung tâm_v2.docx
@@ -319,7 +319,7 @@
         <w:spacing w:after="80"/>
       </w:pPr>
       <w:r>
-        <w:t xml:space="preserve">Chi tiết luồng xử lý, các điểm quyết định và nhánh ngoại lệ được thể hiện trong sơ đồ BPMN dưới đây. Sơ đồ được trình bày theo bố cục dọc (luồng chảy từ trên xuống) và chia thành hai phần nối tiếp nhau:</w:t>
+        <w:t xml:space="preserve">Chi tiết luồng xử lý, các điểm quyết định và nhánh ngoại lệ được thể hiện trong sơ đồ BPMN dưới đây. Sơ đồ được trình bày theo bố cục dọc (luồng chảy từ trên xuống), liền một mạch từ đầu đến cuối quy trình:</w:t>
       </w:r>
     </w:p>
     <w:p>
@@ -333,7 +333,7 @@
         </w:rPr>
         <w:drawing>
           <wp:inline distT="0" distB="0" distL="0" distR="0">
-            <wp:extent cx="5669280" cy="5469187"/>
+            <wp:extent cx="5120640" cy="8433995"/>
             <wp:effectExtent l="0" t="0" r="0" b="0"/>
             <wp:docPr id="101" name="Picture 101"/>
             <wp:cNvGraphicFramePr>
@@ -358,7 +358,7 @@
                   <pic:spPr bwMode="auto">
                     <a:xfrm>
                       <a:off x="0" y="0"/>
-                      <a:ext cx="5669280" cy="5469187"/>
+                      <a:ext cx="5120640" cy="8433995"/>
                     </a:xfrm>
                     <a:prstGeom prst="rect">
                       <a:avLst/>
@@ -381,69 +381,7 @@
           <w:i/>
           <w:iCs/>
         </w:rPr>
-        <w:t xml:space="preserve">Hình (c). Sơ đồ BPMN - giai đoạn tiếp nhận, kiểm tra và chia chọn</w:t>
-      </w:r>
-    </w:p>
-    <w:p>
-      <w:pPr>
-        <w:spacing w:before="120" w:after="160"/>
-        <w:jc w:val="center"/>
-      </w:pPr>
-      <w:r>
-        <w:rPr>
-          <w:noProof/>
-        </w:rPr>
-        <w:drawing>
-          <wp:inline distT="0" distB="0" distL="0" distR="0">
-            <wp:extent cx="5669280" cy="4051867"/>
-            <wp:effectExtent l="0" t="0" r="0" b="0"/>
-            <wp:docPr id="102" name="Picture 102"/>
-            <wp:cNvGraphicFramePr>
-              <a:graphicFrameLocks xmlns:a="http://schemas.openxmlformats.org/drawingml/2006/main" noChangeAspect="1"/>
-            </wp:cNvGraphicFramePr>
-            <a:graphic xmlns:a="http://schemas.openxmlformats.org/drawingml/2006/main">
-              <a:graphicData uri="http://schemas.openxmlformats.org/drawingml/2006/picture">
-                <pic:pic xmlns:pic="http://schemas.openxmlformats.org/drawingml/2006/picture">
-                  <pic:nvPicPr>
-                    <pic:cNvPr id="0" name=""/>
-                    <pic:cNvPicPr>
-                      <a:picLocks noChangeAspect="1" noChangeArrowheads="1"/>
-                    </pic:cNvPicPr>
-                  </pic:nvPicPr>
-                  <pic:blipFill>
-                    <a:blip r:embed="rId102"/>
-                    <a:srcRect/>
-                    <a:stretch>
-                      <a:fillRect/>
-                    </a:stretch>
-                  </pic:blipFill>
-                  <pic:spPr bwMode="auto">
-                    <a:xfrm>
-                      <a:off x="0" y="0"/>
-                      <a:ext cx="5669280" cy="4051867"/>
-                    </a:xfrm>
-                    <a:prstGeom prst="rect">
-                      <a:avLst/>
-                    </a:prstGeom>
-                  </pic:spPr>
-                </pic:pic>
-              </a:graphicData>
-            </a:graphic>
-          </wp:inline>
-        </w:drawing>
-      </w:r>
-    </w:p>
-    <w:p>
-      <w:pPr>
-        <w:spacing w:after="80"/>
-        <w:jc w:val="center"/>
-      </w:pPr>
-      <w:r>
-        <w:rPr>
-          <w:i/>
-          <w:iCs/>
-        </w:rPr>
-        <w:t xml:space="preserve">Hình (d). Sơ đồ BPMN - giai đoạn tập kết, đóng bao và bàn giao vận tải liên tỉnh</w:t>
+        <w:t xml:space="preserve">Hình (c). Sơ đồ BPMN quy trình Phân loại &amp; Chuyển phát trung tâm</w:t>
       </w:r>
     </w:p>
     <w:p>
@@ -6061,767 +5999,12 @@
         <w:t xml:space="preserve">3.1.3.1. Phân tích giá trị gia tăng</w:t>
       </w:r>
     </w:p>
-    <w:tbl>
-      <w:tblPr>
-        <w:tblW w:w="9000" w:type="dxa"/>
-        <w:tblBorders>
-          <w:top w:val="single" w:sz="4" w:space="0" w:color="auto"/>
-          <w:left w:val="single" w:sz="4" w:space="0" w:color="auto"/>
-          <w:bottom w:val="single" w:sz="4" w:space="0" w:color="auto"/>
-          <w:right w:val="single" w:sz="4" w:space="0" w:color="auto"/>
-          <w:insideH w:val="single" w:sz="4" w:space="0" w:color="auto"/>
-          <w:insideV w:val="single" w:sz="4" w:space="0" w:color="auto"/>
-        </w:tblBorders>
-        <w:tblCellMar>
-          <w:left w:w="10" w:type="dxa"/>
-          <w:right w:w="10" w:type="dxa"/>
-        </w:tblCellMar>
-        <w:tblLook w:val="0000" w:firstRow="0" w:lastRow="0" w:firstColumn="0" w:lastColumn="0" w:noHBand="0" w:noVBand="0"/>
-      </w:tblPr>
-      <w:tblGrid>
-        <w:gridCol w:w="4700"/>
-        <w:gridCol w:w="2700"/>
-        <w:gridCol w:w="1600"/>
-      </w:tblGrid>
-      <w:tr>
-        <w:tc>
-          <w:tcPr>
-            <w:tcW w:w="4700" w:type="dxa"/>
-            <w:shd w:val="clear" w:color="auto" w:fill="D9D9D9"/>
-            <w:tcMar>
-              <w:top w:w="80" w:type="dxa"/>
-              <w:left w:w="100" w:type="dxa"/>
-              <w:bottom w:w="80" w:type="dxa"/>
-              <w:right w:w="100" w:type="dxa"/>
-            </w:tcMar>
-            <w:vAlign w:val="center"/>
-          </w:tcPr>
-          <w:p>
-            <w:r>
-              <w:rPr>
-                <w:b/>
-                <w:bCs/>
-                <w:sz w:val="21"/>
-                <w:szCs w:val="21"/>
-              </w:rPr>
-              <w:t xml:space="preserve">Hoạt động</w:t>
-            </w:r>
-          </w:p>
-        </w:tc>
-        <w:tc>
-          <w:tcPr>
-            <w:tcW w:w="2700" w:type="dxa"/>
-            <w:shd w:val="clear" w:color="auto" w:fill="D9D9D9"/>
-            <w:tcMar>
-              <w:top w:w="80" w:type="dxa"/>
-              <w:left w:w="100" w:type="dxa"/>
-              <w:bottom w:w="80" w:type="dxa"/>
-              <w:right w:w="100" w:type="dxa"/>
-            </w:tcMar>
-            <w:vAlign w:val="center"/>
-          </w:tcPr>
-          <w:p>
-            <w:r>
-              <w:rPr>
-                <w:b/>
-                <w:bCs/>
-                <w:sz w:val="21"/>
-                <w:szCs w:val="21"/>
-              </w:rPr>
-              <w:t xml:space="preserve">Người thực hiện</w:t>
-            </w:r>
-          </w:p>
-        </w:tc>
-        <w:tc>
-          <w:tcPr>
-            <w:tcW w:w="1600" w:type="dxa"/>
-            <w:shd w:val="clear" w:color="auto" w:fill="D9D9D9"/>
-            <w:tcMar>
-              <w:top w:w="80" w:type="dxa"/>
-              <w:left w:w="100" w:type="dxa"/>
-              <w:bottom w:w="80" w:type="dxa"/>
-              <w:right w:w="100" w:type="dxa"/>
-            </w:tcMar>
-            <w:vAlign w:val="center"/>
-          </w:tcPr>
-          <w:p>
-            <w:r>
-              <w:rPr>
-                <w:b/>
-                <w:bCs/>
-                <w:sz w:val="21"/>
-                <w:szCs w:val="21"/>
-              </w:rPr>
-              <w:t xml:space="preserve">Loại giá trị</w:t>
-            </w:r>
-          </w:p>
-        </w:tc>
-      </w:tr>
-      <w:tr>
-        <w:tc>
-          <w:tcPr>
-            <w:tcW w:w="4700" w:type="dxa"/>
-            <w:tcMar>
-              <w:top w:w="80" w:type="dxa"/>
-              <w:left w:w="100" w:type="dxa"/>
-              <w:bottom w:w="80" w:type="dxa"/>
-              <w:right w:w="100" w:type="dxa"/>
-            </w:tcMar>
-            <w:vAlign w:val="center"/>
-          </w:tcPr>
-          <w:p>
-            <w:r>
-              <w:rPr>
-                <w:sz w:val="21"/>
-                <w:szCs w:val="21"/>
-              </w:rPr>
-              <w:t xml:space="preserve">Tiếp nhận, kiểm tra seal và đối chiếu manifest</w:t>
-            </w:r>
-          </w:p>
-        </w:tc>
-        <w:tc>
-          <w:tcPr>
-            <w:tcW w:w="2700" w:type="dxa"/>
-            <w:tcMar>
-              <w:top w:w="80" w:type="dxa"/>
-              <w:left w:w="100" w:type="dxa"/>
-              <w:bottom w:w="80" w:type="dxa"/>
-              <w:right w:w="100" w:type="dxa"/>
-            </w:tcMar>
-            <w:vAlign w:val="center"/>
-          </w:tcPr>
-          <w:p>
-            <w:r>
-              <w:rPr>
-                <w:sz w:val="21"/>
-                <w:szCs w:val="21"/>
-              </w:rPr>
-              <w:t xml:space="preserve">Inbound</w:t>
-            </w:r>
-          </w:p>
-        </w:tc>
-        <w:tc>
-          <w:tcPr>
-            <w:tcW w:w="1600" w:type="dxa"/>
-            <w:tcMar>
-              <w:top w:w="80" w:type="dxa"/>
-              <w:left w:w="100" w:type="dxa"/>
-              <w:bottom w:w="80" w:type="dxa"/>
-              <w:right w:w="100" w:type="dxa"/>
-            </w:tcMar>
-            <w:vAlign w:val="center"/>
-          </w:tcPr>
-          <w:p>
-            <w:r>
-              <w:rPr>
-                <w:sz w:val="21"/>
-                <w:szCs w:val="21"/>
-              </w:rPr>
-              <w:t xml:space="preserve">BVA</w:t>
-            </w:r>
-          </w:p>
-        </w:tc>
-      </w:tr>
-      <w:tr>
-        <w:tc>
-          <w:tcPr>
-            <w:tcW w:w="4700" w:type="dxa"/>
-            <w:tcMar>
-              <w:top w:w="80" w:type="dxa"/>
-              <w:left w:w="100" w:type="dxa"/>
-              <w:bottom w:w="80" w:type="dxa"/>
-              <w:right w:w="100" w:type="dxa"/>
-            </w:tcMar>
-            <w:vAlign w:val="center"/>
-          </w:tcPr>
-          <w:p>
-            <w:r>
-              <w:rPr>
-                <w:sz w:val="21"/>
-                <w:szCs w:val="21"/>
-              </w:rPr>
-              <w:t xml:space="preserve">Quét mã, cân và đo bằng DWS</w:t>
-            </w:r>
-          </w:p>
-        </w:tc>
-        <w:tc>
-          <w:tcPr>
-            <w:tcW w:w="2700" w:type="dxa"/>
-            <w:tcMar>
-              <w:top w:w="80" w:type="dxa"/>
-              <w:left w:w="100" w:type="dxa"/>
-              <w:bottom w:w="80" w:type="dxa"/>
-              <w:right w:w="100" w:type="dxa"/>
-            </w:tcMar>
-            <w:vAlign w:val="center"/>
-          </w:tcPr>
-          <w:p>
-            <w:r>
-              <w:rPr>
-                <w:sz w:val="21"/>
-                <w:szCs w:val="21"/>
-              </w:rPr>
-              <w:t xml:space="preserve">Inbound / hệ thống</w:t>
-            </w:r>
-          </w:p>
-        </w:tc>
-        <w:tc>
-          <w:tcPr>
-            <w:tcW w:w="1600" w:type="dxa"/>
-            <w:tcMar>
-              <w:top w:w="80" w:type="dxa"/>
-              <w:left w:w="100" w:type="dxa"/>
-              <w:bottom w:w="80" w:type="dxa"/>
-              <w:right w:w="100" w:type="dxa"/>
-            </w:tcMar>
-            <w:vAlign w:val="center"/>
-          </w:tcPr>
-          <w:p>
-            <w:r>
-              <w:rPr>
-                <w:sz w:val="21"/>
-                <w:szCs w:val="21"/>
-              </w:rPr>
-              <w:t xml:space="preserve">BVA</w:t>
-            </w:r>
-          </w:p>
-        </w:tc>
-      </w:tr>
-      <w:tr>
-        <w:tc>
-          <w:tcPr>
-            <w:tcW w:w="4700" w:type="dxa"/>
-            <w:tcMar>
-              <w:top w:w="80" w:type="dxa"/>
-              <w:left w:w="100" w:type="dxa"/>
-              <w:bottom w:w="80" w:type="dxa"/>
-              <w:right w:w="100" w:type="dxa"/>
-            </w:tcMar>
-            <w:vAlign w:val="center"/>
-          </w:tcPr>
-          <w:p>
-            <w:r>
-              <w:rPr>
-                <w:sz w:val="21"/>
-                <w:szCs w:val="21"/>
-              </w:rPr>
-              <w:t xml:space="preserve">Kiểm tra điều kiện, soi chiếu hoặc sàng lọc</w:t>
-            </w:r>
-          </w:p>
-        </w:tc>
-        <w:tc>
-          <w:tcPr>
-            <w:tcW w:w="2700" w:type="dxa"/>
-            <w:tcMar>
-              <w:top w:w="80" w:type="dxa"/>
-              <w:left w:w="100" w:type="dxa"/>
-              <w:bottom w:w="80" w:type="dxa"/>
-              <w:right w:w="100" w:type="dxa"/>
-            </w:tcMar>
-            <w:vAlign w:val="center"/>
-          </w:tcPr>
-          <w:p>
-            <w:r>
-              <w:rPr>
-                <w:sz w:val="21"/>
-                <w:szCs w:val="21"/>
-              </w:rPr>
-              <w:t xml:space="preserve">Inbound / an ninh</w:t>
-            </w:r>
-          </w:p>
-        </w:tc>
-        <w:tc>
-          <w:tcPr>
-            <w:tcW w:w="1600" w:type="dxa"/>
-            <w:tcMar>
-              <w:top w:w="80" w:type="dxa"/>
-              <w:left w:w="100" w:type="dxa"/>
-              <w:bottom w:w="80" w:type="dxa"/>
-              <w:right w:w="100" w:type="dxa"/>
-            </w:tcMar>
-            <w:vAlign w:val="center"/>
-          </w:tcPr>
-          <w:p>
-            <w:r>
-              <w:rPr>
-                <w:sz w:val="21"/>
-                <w:szCs w:val="21"/>
-              </w:rPr>
-              <w:t xml:space="preserve">BVA</w:t>
-            </w:r>
-          </w:p>
-        </w:tc>
-      </w:tr>
-      <w:tr>
-        <w:tc>
-          <w:tcPr>
-            <w:tcW w:w="4700" w:type="dxa"/>
-            <w:tcMar>
-              <w:top w:w="80" w:type="dxa"/>
-              <w:left w:w="100" w:type="dxa"/>
-              <w:bottom w:w="80" w:type="dxa"/>
-              <w:right w:w="100" w:type="dxa"/>
-            </w:tcMar>
-            <w:vAlign w:val="center"/>
-          </w:tcPr>
-          <w:p>
-            <w:r>
-              <w:rPr>
-                <w:sz w:val="21"/>
-                <w:szCs w:val="21"/>
-              </w:rPr>
-              <w:t xml:space="preserve">Chia chọn tự động hoặc thủ công theo tuyến</w:t>
-            </w:r>
-          </w:p>
-        </w:tc>
-        <w:tc>
-          <w:tcPr>
-            <w:tcW w:w="2700" w:type="dxa"/>
-            <w:tcMar>
-              <w:top w:w="80" w:type="dxa"/>
-              <w:left w:w="100" w:type="dxa"/>
-              <w:bottom w:w="80" w:type="dxa"/>
-              <w:right w:w="100" w:type="dxa"/>
-            </w:tcMar>
-            <w:vAlign w:val="center"/>
-          </w:tcPr>
-          <w:p>
-            <w:r>
-              <w:rPr>
-                <w:sz w:val="21"/>
-                <w:szCs w:val="21"/>
-              </w:rPr>
-              <w:t xml:space="preserve">Hệ thống / khai thác</w:t>
-            </w:r>
-          </w:p>
-        </w:tc>
-        <w:tc>
-          <w:tcPr>
-            <w:tcW w:w="1600" w:type="dxa"/>
-            <w:tcMar>
-              <w:top w:w="80" w:type="dxa"/>
-              <w:left w:w="100" w:type="dxa"/>
-              <w:bottom w:w="80" w:type="dxa"/>
-              <w:right w:w="100" w:type="dxa"/>
-            </w:tcMar>
-            <w:vAlign w:val="center"/>
-          </w:tcPr>
-          <w:p>
-            <w:r>
-              <w:rPr>
-                <w:sz w:val="21"/>
-                <w:szCs w:val="21"/>
-              </w:rPr>
-              <w:t xml:space="preserve">VA</w:t>
-            </w:r>
-          </w:p>
-        </w:tc>
-      </w:tr>
-      <w:tr>
-        <w:tc>
-          <w:tcPr>
-            <w:tcW w:w="4700" w:type="dxa"/>
-            <w:tcMar>
-              <w:top w:w="80" w:type="dxa"/>
-              <w:left w:w="100" w:type="dxa"/>
-              <w:bottom w:w="80" w:type="dxa"/>
-              <w:right w:w="100" w:type="dxa"/>
-            </w:tcMar>
-            <w:vAlign w:val="center"/>
-          </w:tcPr>
-          <w:p>
-            <w:r>
-              <w:rPr>
-                <w:sz w:val="21"/>
-                <w:szCs w:val="21"/>
-              </w:rPr>
-              <w:t xml:space="preserve">Xác nhận kết quả phân loại</w:t>
-            </w:r>
-          </w:p>
-        </w:tc>
-        <w:tc>
-          <w:tcPr>
-            <w:tcW w:w="2700" w:type="dxa"/>
-            <w:tcMar>
-              <w:top w:w="80" w:type="dxa"/>
-              <w:left w:w="100" w:type="dxa"/>
-              <w:bottom w:w="80" w:type="dxa"/>
-              <w:right w:w="100" w:type="dxa"/>
-            </w:tcMar>
-            <w:vAlign w:val="center"/>
-          </w:tcPr>
-          <w:p>
-            <w:r>
-              <w:rPr>
-                <w:sz w:val="21"/>
-                <w:szCs w:val="21"/>
-              </w:rPr>
-              <w:t xml:space="preserve">Vận hành hệ thống</w:t>
-            </w:r>
-          </w:p>
-        </w:tc>
-        <w:tc>
-          <w:tcPr>
-            <w:tcW w:w="1600" w:type="dxa"/>
-            <w:tcMar>
-              <w:top w:w="80" w:type="dxa"/>
-              <w:left w:w="100" w:type="dxa"/>
-              <w:bottom w:w="80" w:type="dxa"/>
-              <w:right w:w="100" w:type="dxa"/>
-            </w:tcMar>
-            <w:vAlign w:val="center"/>
-          </w:tcPr>
-          <w:p>
-            <w:r>
-              <w:rPr>
-                <w:sz w:val="21"/>
-                <w:szCs w:val="21"/>
-              </w:rPr>
-              <w:t xml:space="preserve">BVA</w:t>
-            </w:r>
-          </w:p>
-        </w:tc>
-      </w:tr>
-      <w:tr>
-        <w:tc>
-          <w:tcPr>
-            <w:tcW w:w="4700" w:type="dxa"/>
-            <w:tcMar>
-              <w:top w:w="80" w:type="dxa"/>
-              <w:left w:w="100" w:type="dxa"/>
-              <w:bottom w:w="80" w:type="dxa"/>
-              <w:right w:w="100" w:type="dxa"/>
-            </w:tcMar>
-            <w:vAlign w:val="center"/>
-          </w:tcPr>
-          <w:p>
-            <w:r>
-              <w:rPr>
-                <w:sz w:val="21"/>
-                <w:szCs w:val="21"/>
-              </w:rPr>
-              <w:t xml:space="preserve">Xử lý lại no-read hoặc sai tuyến</w:t>
-            </w:r>
-          </w:p>
-        </w:tc>
-        <w:tc>
-          <w:tcPr>
-            <w:tcW w:w="2700" w:type="dxa"/>
-            <w:tcMar>
-              <w:top w:w="80" w:type="dxa"/>
-              <w:left w:w="100" w:type="dxa"/>
-              <w:bottom w:w="80" w:type="dxa"/>
-              <w:right w:w="100" w:type="dxa"/>
-            </w:tcMar>
-            <w:vAlign w:val="center"/>
-          </w:tcPr>
-          <w:p>
-            <w:r>
-              <w:rPr>
-                <w:sz w:val="21"/>
-                <w:szCs w:val="21"/>
-              </w:rPr>
-              <w:t xml:space="preserve">Vận hành hệ thống</w:t>
-            </w:r>
-          </w:p>
-        </w:tc>
-        <w:tc>
-          <w:tcPr>
-            <w:tcW w:w="1600" w:type="dxa"/>
-            <w:tcMar>
-              <w:top w:w="80" w:type="dxa"/>
-              <w:left w:w="100" w:type="dxa"/>
-              <w:bottom w:w="80" w:type="dxa"/>
-              <w:right w:w="100" w:type="dxa"/>
-            </w:tcMar>
-            <w:vAlign w:val="center"/>
-          </w:tcPr>
-          <w:p>
-            <w:r>
-              <w:rPr>
-                <w:sz w:val="21"/>
-                <w:szCs w:val="21"/>
-              </w:rPr>
-              <w:t xml:space="preserve">NVA</w:t>
-            </w:r>
-          </w:p>
-        </w:tc>
-      </w:tr>
-      <w:tr>
-        <w:tc>
-          <w:tcPr>
-            <w:tcW w:w="4700" w:type="dxa"/>
-            <w:tcMar>
-              <w:top w:w="80" w:type="dxa"/>
-              <w:left w:w="100" w:type="dxa"/>
-              <w:bottom w:w="80" w:type="dxa"/>
-              <w:right w:w="100" w:type="dxa"/>
-            </w:tcMar>
-            <w:vAlign w:val="center"/>
-          </w:tcPr>
-          <w:p>
-            <w:r>
-              <w:rPr>
-                <w:sz w:val="21"/>
-                <w:szCs w:val="21"/>
-              </w:rPr>
-              <w:t xml:space="preserve">Chờ giờ cắt chuyến hoặc chờ phương tiện</w:t>
-            </w:r>
-          </w:p>
-        </w:tc>
-        <w:tc>
-          <w:tcPr>
-            <w:tcW w:w="2700" w:type="dxa"/>
-            <w:tcMar>
-              <w:top w:w="80" w:type="dxa"/>
-              <w:left w:w="100" w:type="dxa"/>
-              <w:bottom w:w="80" w:type="dxa"/>
-              <w:right w:w="100" w:type="dxa"/>
-            </w:tcMar>
-            <w:vAlign w:val="center"/>
-          </w:tcPr>
-          <w:p>
-            <w:r>
-              <w:rPr>
-                <w:sz w:val="21"/>
-                <w:szCs w:val="21"/>
-              </w:rPr>
-              <w:t xml:space="preserve">Outbound</w:t>
-            </w:r>
-          </w:p>
-        </w:tc>
-        <w:tc>
-          <w:tcPr>
-            <w:tcW w:w="1600" w:type="dxa"/>
-            <w:tcMar>
-              <w:top w:w="80" w:type="dxa"/>
-              <w:left w:w="100" w:type="dxa"/>
-              <w:bottom w:w="80" w:type="dxa"/>
-              <w:right w:w="100" w:type="dxa"/>
-            </w:tcMar>
-            <w:vAlign w:val="center"/>
-          </w:tcPr>
-          <w:p>
-            <w:r>
-              <w:rPr>
-                <w:sz w:val="21"/>
-                <w:szCs w:val="21"/>
-              </w:rPr>
-              <w:t xml:space="preserve">NVA</w:t>
-            </w:r>
-          </w:p>
-        </w:tc>
-      </w:tr>
-      <w:tr>
-        <w:tc>
-          <w:tcPr>
-            <w:tcW w:w="4700" w:type="dxa"/>
-            <w:tcMar>
-              <w:top w:w="80" w:type="dxa"/>
-              <w:left w:w="100" w:type="dxa"/>
-              <w:bottom w:w="80" w:type="dxa"/>
-              <w:right w:w="100" w:type="dxa"/>
-            </w:tcMar>
-            <w:vAlign w:val="center"/>
-          </w:tcPr>
-          <w:p>
-            <w:r>
-              <w:rPr>
-                <w:sz w:val="21"/>
-                <w:szCs w:val="21"/>
-              </w:rPr>
-              <w:t xml:space="preserve">Đóng bao/container và liên kết kiện với tuyến</w:t>
-            </w:r>
-          </w:p>
-        </w:tc>
-        <w:tc>
-          <w:tcPr>
-            <w:tcW w:w="2700" w:type="dxa"/>
-            <w:tcMar>
-              <w:top w:w="80" w:type="dxa"/>
-              <w:left w:w="100" w:type="dxa"/>
-              <w:bottom w:w="80" w:type="dxa"/>
-              <w:right w:w="100" w:type="dxa"/>
-            </w:tcMar>
-            <w:vAlign w:val="center"/>
-          </w:tcPr>
-          <w:p>
-            <w:r>
-              <w:rPr>
-                <w:sz w:val="21"/>
-                <w:szCs w:val="21"/>
-              </w:rPr>
-              <w:t xml:space="preserve">Outbound</w:t>
-            </w:r>
-          </w:p>
-        </w:tc>
-        <w:tc>
-          <w:tcPr>
-            <w:tcW w:w="1600" w:type="dxa"/>
-            <w:tcMar>
-              <w:top w:w="80" w:type="dxa"/>
-              <w:left w:w="100" w:type="dxa"/>
-              <w:bottom w:w="80" w:type="dxa"/>
-              <w:right w:w="100" w:type="dxa"/>
-            </w:tcMar>
-            <w:vAlign w:val="center"/>
-          </w:tcPr>
-          <w:p>
-            <w:r>
-              <w:rPr>
-                <w:sz w:val="21"/>
-                <w:szCs w:val="21"/>
-              </w:rPr>
-              <w:t xml:space="preserve">VA</w:t>
-            </w:r>
-          </w:p>
-        </w:tc>
-      </w:tr>
-      <w:tr>
-        <w:tc>
-          <w:tcPr>
-            <w:tcW w:w="4700" w:type="dxa"/>
-            <w:tcMar>
-              <w:top w:w="80" w:type="dxa"/>
-              <w:left w:w="100" w:type="dxa"/>
-              <w:bottom w:w="80" w:type="dxa"/>
-              <w:right w:w="100" w:type="dxa"/>
-            </w:tcMar>
-            <w:vAlign w:val="center"/>
-          </w:tcPr>
-          <w:p>
-            <w:r>
-              <w:rPr>
-                <w:sz w:val="21"/>
-                <w:szCs w:val="21"/>
-              </w:rPr>
-              <w:t xml:space="preserve">Đối soát, niêm phong và đóng manifest</w:t>
-            </w:r>
-          </w:p>
-        </w:tc>
-        <w:tc>
-          <w:tcPr>
-            <w:tcW w:w="2700" w:type="dxa"/>
-            <w:tcMar>
-              <w:top w:w="80" w:type="dxa"/>
-              <w:left w:w="100" w:type="dxa"/>
-              <w:bottom w:w="80" w:type="dxa"/>
-              <w:right w:w="100" w:type="dxa"/>
-            </w:tcMar>
-            <w:vAlign w:val="center"/>
-          </w:tcPr>
-          <w:p>
-            <w:r>
-              <w:rPr>
-                <w:sz w:val="21"/>
-                <w:szCs w:val="21"/>
-              </w:rPr>
-              <w:t xml:space="preserve">Outbound</w:t>
-            </w:r>
-          </w:p>
-        </w:tc>
-        <w:tc>
-          <w:tcPr>
-            <w:tcW w:w="1600" w:type="dxa"/>
-            <w:tcMar>
-              <w:top w:w="80" w:type="dxa"/>
-              <w:left w:w="100" w:type="dxa"/>
-              <w:bottom w:w="80" w:type="dxa"/>
-              <w:right w:w="100" w:type="dxa"/>
-            </w:tcMar>
-            <w:vAlign w:val="center"/>
-          </w:tcPr>
-          <w:p>
-            <w:r>
-              <w:rPr>
-                <w:sz w:val="21"/>
-                <w:szCs w:val="21"/>
-              </w:rPr>
-              <w:t xml:space="preserve">BVA</w:t>
-            </w:r>
-          </w:p>
-        </w:tc>
-      </w:tr>
-      <w:tr>
-        <w:tc>
-          <w:tcPr>
-            <w:tcW w:w="4700" w:type="dxa"/>
-            <w:tcMar>
-              <w:top w:w="80" w:type="dxa"/>
-              <w:left w:w="100" w:type="dxa"/>
-              <w:bottom w:w="80" w:type="dxa"/>
-              <w:right w:w="100" w:type="dxa"/>
-            </w:tcMar>
-            <w:vAlign w:val="center"/>
-          </w:tcPr>
-          <w:p>
-            <w:r>
-              <w:rPr>
-                <w:sz w:val="21"/>
-                <w:szCs w:val="21"/>
-              </w:rPr>
-              <w:t xml:space="preserve">Xếp xe, ký nhận và cập nhật trạng thái</w:t>
-            </w:r>
-          </w:p>
-        </w:tc>
-        <w:tc>
-          <w:tcPr>
-            <w:tcW w:w="2700" w:type="dxa"/>
-            <w:tcMar>
-              <w:top w:w="80" w:type="dxa"/>
-              <w:left w:w="100" w:type="dxa"/>
-              <w:bottom w:w="80" w:type="dxa"/>
-              <w:right w:w="100" w:type="dxa"/>
-            </w:tcMar>
-            <w:vAlign w:val="center"/>
-          </w:tcPr>
-          <w:p>
-            <w:r>
-              <w:rPr>
-                <w:sz w:val="21"/>
-                <w:szCs w:val="21"/>
-              </w:rPr>
-              <w:t xml:space="preserve">Outbound / vận tải</w:t>
-            </w:r>
-          </w:p>
-        </w:tc>
-        <w:tc>
-          <w:tcPr>
-            <w:tcW w:w="1600" w:type="dxa"/>
-            <w:tcMar>
-              <w:top w:w="80" w:type="dxa"/>
-              <w:left w:w="100" w:type="dxa"/>
-              <w:bottom w:w="80" w:type="dxa"/>
-              <w:right w:w="100" w:type="dxa"/>
-            </w:tcMar>
-            <w:vAlign w:val="center"/>
-          </w:tcPr>
-          <w:p>
-            <w:r>
-              <w:rPr>
-                <w:sz w:val="21"/>
-                <w:szCs w:val="21"/>
-              </w:rPr>
-              <w:t xml:space="preserve">BVA</w:t>
-            </w:r>
-          </w:p>
-        </w:tc>
-      </w:tr>
-    </w:tbl>
-    <w:p>
-      <w:pPr>
-        <w:spacing w:after="120"/>
-      </w:pPr>
-      <w:r>
-        <w:t xml:space="preserve"/>
-      </w:r>
-    </w:p>
     <w:p>
       <w:pPr>
         <w:spacing w:after="80"/>
       </w:pPr>
       <w:r>
-        <w:t xml:space="preserve">Kết quả phân loại giá trị gia tăng ở bảng trên được thể hiện trực tiếp lên sơ đồ BPMN bằng các nhãn màu gắn cạnh từng hoạt động, giúp nhận diện nhanh tỷ trọng VA/BVA/NVA theo từng khu vực xử lý:</w:t>
+        <w:t xml:space="preserve">Kết quả phân loại giá trị gia tăng được thể hiện trực tiếp lên sơ đồ BPMN bằng các nhãn màu gắn cạnh từng hoạt động, giúp nhận diện nhanh tỷ trọng VA/BVA/NVA theo từng khu vực xử lý trước khi đối chiếu với bảng phân tích chi tiết bên dưới:</w:t>
       </w:r>
     </w:p>
     <w:p>
@@ -6835,7 +6018,7 @@
         </w:rPr>
         <w:drawing>
           <wp:inline distT="0" distB="0" distL="0" distR="0">
-            <wp:extent cx="5669280" cy="5469187"/>
+            <wp:extent cx="5120640" cy="8433995"/>
             <wp:effectExtent l="0" t="0" r="0" b="0"/>
             <wp:docPr id="111" name="Picture 111"/>
             <wp:cNvGraphicFramePr>
@@ -6860,7 +6043,7 @@
                   <pic:spPr bwMode="auto">
                     <a:xfrm>
                       <a:off x="0" y="0"/>
-                      <a:ext cx="5669280" cy="5469187"/>
+                      <a:ext cx="5120640" cy="8433995"/>
                     </a:xfrm>
                     <a:prstGeom prst="rect">
                       <a:avLst/>
@@ -6883,69 +6066,762 @@
           <w:i/>
           <w:iCs/>
         </w:rPr>
-        <w:t xml:space="preserve">Hình (g). Sơ đồ BPMN gắn nhãn giá trị gia tăng - giai đoạn tiếp nhận, kiểm tra và chia chọn</w:t>
-      </w:r>
-    </w:p>
-    <w:p>
-      <w:pPr>
-        <w:spacing w:before="120" w:after="160"/>
-        <w:jc w:val="center"/>
-      </w:pPr>
-      <w:r>
-        <w:rPr>
-          <w:noProof/>
-        </w:rPr>
-        <w:drawing>
-          <wp:inline distT="0" distB="0" distL="0" distR="0">
-            <wp:extent cx="5669280" cy="4051867"/>
-            <wp:effectExtent l="0" t="0" r="0" b="0"/>
-            <wp:docPr id="112" name="Picture 112"/>
-            <wp:cNvGraphicFramePr>
-              <a:graphicFrameLocks xmlns:a="http://schemas.openxmlformats.org/drawingml/2006/main" noChangeAspect="1"/>
-            </wp:cNvGraphicFramePr>
-            <a:graphic xmlns:a="http://schemas.openxmlformats.org/drawingml/2006/main">
-              <a:graphicData uri="http://schemas.openxmlformats.org/drawingml/2006/picture">
-                <pic:pic xmlns:pic="http://schemas.openxmlformats.org/drawingml/2006/picture">
-                  <pic:nvPicPr>
-                    <pic:cNvPr id="0" name=""/>
-                    <pic:cNvPicPr>
-                      <a:picLocks noChangeAspect="1" noChangeArrowheads="1"/>
-                    </pic:cNvPicPr>
-                  </pic:nvPicPr>
-                  <pic:blipFill>
-                    <a:blip r:embed="rId112"/>
-                    <a:srcRect/>
-                    <a:stretch>
-                      <a:fillRect/>
-                    </a:stretch>
-                  </pic:blipFill>
-                  <pic:spPr bwMode="auto">
-                    <a:xfrm>
-                      <a:off x="0" y="0"/>
-                      <a:ext cx="5669280" cy="4051867"/>
-                    </a:xfrm>
-                    <a:prstGeom prst="rect">
-                      <a:avLst/>
-                    </a:prstGeom>
-                  </pic:spPr>
-                </pic:pic>
-              </a:graphicData>
-            </a:graphic>
-          </wp:inline>
-        </w:drawing>
-      </w:r>
-    </w:p>
-    <w:p>
-      <w:pPr>
-        <w:spacing w:after="80"/>
-        <w:jc w:val="center"/>
-      </w:pPr>
-      <w:r>
-        <w:rPr>
-          <w:i/>
-          <w:iCs/>
-        </w:rPr>
-        <w:t xml:space="preserve">Hình (h). Sơ đồ BPMN gắn nhãn giá trị gia tăng - giai đoạn tập kết, đóng bao và bàn giao</w:t>
+        <w:t xml:space="preserve">Hình (g). Sơ đồ BPMN gắn nhãn giá trị gia tăng</w:t>
+      </w:r>
+    </w:p>
+    <w:tbl>
+      <w:tblPr>
+        <w:tblW w:w="9000" w:type="dxa"/>
+        <w:tblBorders>
+          <w:top w:val="single" w:sz="4" w:space="0" w:color="auto"/>
+          <w:left w:val="single" w:sz="4" w:space="0" w:color="auto"/>
+          <w:bottom w:val="single" w:sz="4" w:space="0" w:color="auto"/>
+          <w:right w:val="single" w:sz="4" w:space="0" w:color="auto"/>
+          <w:insideH w:val="single" w:sz="4" w:space="0" w:color="auto"/>
+          <w:insideV w:val="single" w:sz="4" w:space="0" w:color="auto"/>
+        </w:tblBorders>
+        <w:tblCellMar>
+          <w:left w:w="10" w:type="dxa"/>
+          <w:right w:w="10" w:type="dxa"/>
+        </w:tblCellMar>
+        <w:tblLook w:val="0000" w:firstRow="0" w:lastRow="0" w:firstColumn="0" w:lastColumn="0" w:noHBand="0" w:noVBand="0"/>
+      </w:tblPr>
+      <w:tblGrid>
+        <w:gridCol w:w="4700"/>
+        <w:gridCol w:w="2700"/>
+        <w:gridCol w:w="1600"/>
+      </w:tblGrid>
+      <w:tr>
+        <w:tc>
+          <w:tcPr>
+            <w:tcW w:w="4700" w:type="dxa"/>
+            <w:shd w:val="clear" w:color="auto" w:fill="D9D9D9"/>
+            <w:tcMar>
+              <w:top w:w="80" w:type="dxa"/>
+              <w:left w:w="100" w:type="dxa"/>
+              <w:bottom w:w="80" w:type="dxa"/>
+              <w:right w:w="100" w:type="dxa"/>
+            </w:tcMar>
+            <w:vAlign w:val="center"/>
+          </w:tcPr>
+          <w:p>
+            <w:r>
+              <w:rPr>
+                <w:b/>
+                <w:bCs/>
+                <w:sz w:val="21"/>
+                <w:szCs w:val="21"/>
+              </w:rPr>
+              <w:t xml:space="preserve">Hoạt động</w:t>
+            </w:r>
+          </w:p>
+        </w:tc>
+        <w:tc>
+          <w:tcPr>
+            <w:tcW w:w="2700" w:type="dxa"/>
+            <w:shd w:val="clear" w:color="auto" w:fill="D9D9D9"/>
+            <w:tcMar>
+              <w:top w:w="80" w:type="dxa"/>
+              <w:left w:w="100" w:type="dxa"/>
+              <w:bottom w:w="80" w:type="dxa"/>
+              <w:right w:w="100" w:type="dxa"/>
+            </w:tcMar>
+            <w:vAlign w:val="center"/>
+          </w:tcPr>
+          <w:p>
+            <w:r>
+              <w:rPr>
+                <w:b/>
+                <w:bCs/>
+                <w:sz w:val="21"/>
+                <w:szCs w:val="21"/>
+              </w:rPr>
+              <w:t xml:space="preserve">Người thực hiện</w:t>
+            </w:r>
+          </w:p>
+        </w:tc>
+        <w:tc>
+          <w:tcPr>
+            <w:tcW w:w="1600" w:type="dxa"/>
+            <w:shd w:val="clear" w:color="auto" w:fill="D9D9D9"/>
+            <w:tcMar>
+              <w:top w:w="80" w:type="dxa"/>
+              <w:left w:w="100" w:type="dxa"/>
+              <w:bottom w:w="80" w:type="dxa"/>
+              <w:right w:w="100" w:type="dxa"/>
+            </w:tcMar>
+            <w:vAlign w:val="center"/>
+          </w:tcPr>
+          <w:p>
+            <w:r>
+              <w:rPr>
+                <w:b/>
+                <w:bCs/>
+                <w:sz w:val="21"/>
+                <w:szCs w:val="21"/>
+              </w:rPr>
+              <w:t xml:space="preserve">Loại giá trị</w:t>
+            </w:r>
+          </w:p>
+        </w:tc>
+      </w:tr>
+      <w:tr>
+        <w:tc>
+          <w:tcPr>
+            <w:tcW w:w="4700" w:type="dxa"/>
+            <w:tcMar>
+              <w:top w:w="80" w:type="dxa"/>
+              <w:left w:w="100" w:type="dxa"/>
+              <w:bottom w:w="80" w:type="dxa"/>
+              <w:right w:w="100" w:type="dxa"/>
+            </w:tcMar>
+            <w:vAlign w:val="center"/>
+          </w:tcPr>
+          <w:p>
+            <w:r>
+              <w:rPr>
+                <w:sz w:val="21"/>
+                <w:szCs w:val="21"/>
+              </w:rPr>
+              <w:t xml:space="preserve">Tiếp nhận, kiểm tra seal và đối chiếu manifest</w:t>
+            </w:r>
+          </w:p>
+        </w:tc>
+        <w:tc>
+          <w:tcPr>
+            <w:tcW w:w="2700" w:type="dxa"/>
+            <w:tcMar>
+              <w:top w:w="80" w:type="dxa"/>
+              <w:left w:w="100" w:type="dxa"/>
+              <w:bottom w:w="80" w:type="dxa"/>
+              <w:right w:w="100" w:type="dxa"/>
+            </w:tcMar>
+            <w:vAlign w:val="center"/>
+          </w:tcPr>
+          <w:p>
+            <w:r>
+              <w:rPr>
+                <w:sz w:val="21"/>
+                <w:szCs w:val="21"/>
+              </w:rPr>
+              <w:t xml:space="preserve">Inbound</w:t>
+            </w:r>
+          </w:p>
+        </w:tc>
+        <w:tc>
+          <w:tcPr>
+            <w:tcW w:w="1600" w:type="dxa"/>
+            <w:tcMar>
+              <w:top w:w="80" w:type="dxa"/>
+              <w:left w:w="100" w:type="dxa"/>
+              <w:bottom w:w="80" w:type="dxa"/>
+              <w:right w:w="100" w:type="dxa"/>
+            </w:tcMar>
+            <w:vAlign w:val="center"/>
+          </w:tcPr>
+          <w:p>
+            <w:r>
+              <w:rPr>
+                <w:sz w:val="21"/>
+                <w:szCs w:val="21"/>
+              </w:rPr>
+              <w:t xml:space="preserve">BVA</w:t>
+            </w:r>
+          </w:p>
+        </w:tc>
+      </w:tr>
+      <w:tr>
+        <w:tc>
+          <w:tcPr>
+            <w:tcW w:w="4700" w:type="dxa"/>
+            <w:tcMar>
+              <w:top w:w="80" w:type="dxa"/>
+              <w:left w:w="100" w:type="dxa"/>
+              <w:bottom w:w="80" w:type="dxa"/>
+              <w:right w:w="100" w:type="dxa"/>
+            </w:tcMar>
+            <w:vAlign w:val="center"/>
+          </w:tcPr>
+          <w:p>
+            <w:r>
+              <w:rPr>
+                <w:sz w:val="21"/>
+                <w:szCs w:val="21"/>
+              </w:rPr>
+              <w:t xml:space="preserve">Quét mã, cân và đo bằng DWS</w:t>
+            </w:r>
+          </w:p>
+        </w:tc>
+        <w:tc>
+          <w:tcPr>
+            <w:tcW w:w="2700" w:type="dxa"/>
+            <w:tcMar>
+              <w:top w:w="80" w:type="dxa"/>
+              <w:left w:w="100" w:type="dxa"/>
+              <w:bottom w:w="80" w:type="dxa"/>
+              <w:right w:w="100" w:type="dxa"/>
+            </w:tcMar>
+            <w:vAlign w:val="center"/>
+          </w:tcPr>
+          <w:p>
+            <w:r>
+              <w:rPr>
+                <w:sz w:val="21"/>
+                <w:szCs w:val="21"/>
+              </w:rPr>
+              <w:t xml:space="preserve">Inbound / hệ thống</w:t>
+            </w:r>
+          </w:p>
+        </w:tc>
+        <w:tc>
+          <w:tcPr>
+            <w:tcW w:w="1600" w:type="dxa"/>
+            <w:tcMar>
+              <w:top w:w="80" w:type="dxa"/>
+              <w:left w:w="100" w:type="dxa"/>
+              <w:bottom w:w="80" w:type="dxa"/>
+              <w:right w:w="100" w:type="dxa"/>
+            </w:tcMar>
+            <w:vAlign w:val="center"/>
+          </w:tcPr>
+          <w:p>
+            <w:r>
+              <w:rPr>
+                <w:sz w:val="21"/>
+                <w:szCs w:val="21"/>
+              </w:rPr>
+              <w:t xml:space="preserve">BVA</w:t>
+            </w:r>
+          </w:p>
+        </w:tc>
+      </w:tr>
+      <w:tr>
+        <w:tc>
+          <w:tcPr>
+            <w:tcW w:w="4700" w:type="dxa"/>
+            <w:tcMar>
+              <w:top w:w="80" w:type="dxa"/>
+              <w:left w:w="100" w:type="dxa"/>
+              <w:bottom w:w="80" w:type="dxa"/>
+              <w:right w:w="100" w:type="dxa"/>
+            </w:tcMar>
+            <w:vAlign w:val="center"/>
+          </w:tcPr>
+          <w:p>
+            <w:r>
+              <w:rPr>
+                <w:sz w:val="21"/>
+                <w:szCs w:val="21"/>
+              </w:rPr>
+              <w:t xml:space="preserve">Kiểm tra điều kiện, soi chiếu hoặc sàng lọc</w:t>
+            </w:r>
+          </w:p>
+        </w:tc>
+        <w:tc>
+          <w:tcPr>
+            <w:tcW w:w="2700" w:type="dxa"/>
+            <w:tcMar>
+              <w:top w:w="80" w:type="dxa"/>
+              <w:left w:w="100" w:type="dxa"/>
+              <w:bottom w:w="80" w:type="dxa"/>
+              <w:right w:w="100" w:type="dxa"/>
+            </w:tcMar>
+            <w:vAlign w:val="center"/>
+          </w:tcPr>
+          <w:p>
+            <w:r>
+              <w:rPr>
+                <w:sz w:val="21"/>
+                <w:szCs w:val="21"/>
+              </w:rPr>
+              <w:t xml:space="preserve">Inbound / an ninh</w:t>
+            </w:r>
+          </w:p>
+        </w:tc>
+        <w:tc>
+          <w:tcPr>
+            <w:tcW w:w="1600" w:type="dxa"/>
+            <w:tcMar>
+              <w:top w:w="80" w:type="dxa"/>
+              <w:left w:w="100" w:type="dxa"/>
+              <w:bottom w:w="80" w:type="dxa"/>
+              <w:right w:w="100" w:type="dxa"/>
+            </w:tcMar>
+            <w:vAlign w:val="center"/>
+          </w:tcPr>
+          <w:p>
+            <w:r>
+              <w:rPr>
+                <w:sz w:val="21"/>
+                <w:szCs w:val="21"/>
+              </w:rPr>
+              <w:t xml:space="preserve">BVA</w:t>
+            </w:r>
+          </w:p>
+        </w:tc>
+      </w:tr>
+      <w:tr>
+        <w:tc>
+          <w:tcPr>
+            <w:tcW w:w="4700" w:type="dxa"/>
+            <w:tcMar>
+              <w:top w:w="80" w:type="dxa"/>
+              <w:left w:w="100" w:type="dxa"/>
+              <w:bottom w:w="80" w:type="dxa"/>
+              <w:right w:w="100" w:type="dxa"/>
+            </w:tcMar>
+            <w:vAlign w:val="center"/>
+          </w:tcPr>
+          <w:p>
+            <w:r>
+              <w:rPr>
+                <w:sz w:val="21"/>
+                <w:szCs w:val="21"/>
+              </w:rPr>
+              <w:t xml:space="preserve">Chia chọn tự động hoặc thủ công theo tuyến</w:t>
+            </w:r>
+          </w:p>
+        </w:tc>
+        <w:tc>
+          <w:tcPr>
+            <w:tcW w:w="2700" w:type="dxa"/>
+            <w:tcMar>
+              <w:top w:w="80" w:type="dxa"/>
+              <w:left w:w="100" w:type="dxa"/>
+              <w:bottom w:w="80" w:type="dxa"/>
+              <w:right w:w="100" w:type="dxa"/>
+            </w:tcMar>
+            <w:vAlign w:val="center"/>
+          </w:tcPr>
+          <w:p>
+            <w:r>
+              <w:rPr>
+                <w:sz w:val="21"/>
+                <w:szCs w:val="21"/>
+              </w:rPr>
+              <w:t xml:space="preserve">Hệ thống / khai thác</w:t>
+            </w:r>
+          </w:p>
+        </w:tc>
+        <w:tc>
+          <w:tcPr>
+            <w:tcW w:w="1600" w:type="dxa"/>
+            <w:tcMar>
+              <w:top w:w="80" w:type="dxa"/>
+              <w:left w:w="100" w:type="dxa"/>
+              <w:bottom w:w="80" w:type="dxa"/>
+              <w:right w:w="100" w:type="dxa"/>
+            </w:tcMar>
+            <w:vAlign w:val="center"/>
+          </w:tcPr>
+          <w:p>
+            <w:r>
+              <w:rPr>
+                <w:sz w:val="21"/>
+                <w:szCs w:val="21"/>
+              </w:rPr>
+              <w:t xml:space="preserve">VA</w:t>
+            </w:r>
+          </w:p>
+        </w:tc>
+      </w:tr>
+      <w:tr>
+        <w:tc>
+          <w:tcPr>
+            <w:tcW w:w="4700" w:type="dxa"/>
+            <w:tcMar>
+              <w:top w:w="80" w:type="dxa"/>
+              <w:left w:w="100" w:type="dxa"/>
+              <w:bottom w:w="80" w:type="dxa"/>
+              <w:right w:w="100" w:type="dxa"/>
+            </w:tcMar>
+            <w:vAlign w:val="center"/>
+          </w:tcPr>
+          <w:p>
+            <w:r>
+              <w:rPr>
+                <w:sz w:val="21"/>
+                <w:szCs w:val="21"/>
+              </w:rPr>
+              <w:t xml:space="preserve">Xác nhận kết quả phân loại</w:t>
+            </w:r>
+          </w:p>
+        </w:tc>
+        <w:tc>
+          <w:tcPr>
+            <w:tcW w:w="2700" w:type="dxa"/>
+            <w:tcMar>
+              <w:top w:w="80" w:type="dxa"/>
+              <w:left w:w="100" w:type="dxa"/>
+              <w:bottom w:w="80" w:type="dxa"/>
+              <w:right w:w="100" w:type="dxa"/>
+            </w:tcMar>
+            <w:vAlign w:val="center"/>
+          </w:tcPr>
+          <w:p>
+            <w:r>
+              <w:rPr>
+                <w:sz w:val="21"/>
+                <w:szCs w:val="21"/>
+              </w:rPr>
+              <w:t xml:space="preserve">Vận hành hệ thống</w:t>
+            </w:r>
+          </w:p>
+        </w:tc>
+        <w:tc>
+          <w:tcPr>
+            <w:tcW w:w="1600" w:type="dxa"/>
+            <w:tcMar>
+              <w:top w:w="80" w:type="dxa"/>
+              <w:left w:w="100" w:type="dxa"/>
+              <w:bottom w:w="80" w:type="dxa"/>
+              <w:right w:w="100" w:type="dxa"/>
+            </w:tcMar>
+            <w:vAlign w:val="center"/>
+          </w:tcPr>
+          <w:p>
+            <w:r>
+              <w:rPr>
+                <w:sz w:val="21"/>
+                <w:szCs w:val="21"/>
+              </w:rPr>
+              <w:t xml:space="preserve">BVA</w:t>
+            </w:r>
+          </w:p>
+        </w:tc>
+      </w:tr>
+      <w:tr>
+        <w:tc>
+          <w:tcPr>
+            <w:tcW w:w="4700" w:type="dxa"/>
+            <w:tcMar>
+              <w:top w:w="80" w:type="dxa"/>
+              <w:left w:w="100" w:type="dxa"/>
+              <w:bottom w:w="80" w:type="dxa"/>
+              <w:right w:w="100" w:type="dxa"/>
+            </w:tcMar>
+            <w:vAlign w:val="center"/>
+          </w:tcPr>
+          <w:p>
+            <w:r>
+              <w:rPr>
+                <w:sz w:val="21"/>
+                <w:szCs w:val="21"/>
+              </w:rPr>
+              <w:t xml:space="preserve">Xử lý lại no-read hoặc sai tuyến</w:t>
+            </w:r>
+          </w:p>
+        </w:tc>
+        <w:tc>
+          <w:tcPr>
+            <w:tcW w:w="2700" w:type="dxa"/>
+            <w:tcMar>
+              <w:top w:w="80" w:type="dxa"/>
+              <w:left w:w="100" w:type="dxa"/>
+              <w:bottom w:w="80" w:type="dxa"/>
+              <w:right w:w="100" w:type="dxa"/>
+            </w:tcMar>
+            <w:vAlign w:val="center"/>
+          </w:tcPr>
+          <w:p>
+            <w:r>
+              <w:rPr>
+                <w:sz w:val="21"/>
+                <w:szCs w:val="21"/>
+              </w:rPr>
+              <w:t xml:space="preserve">Vận hành hệ thống</w:t>
+            </w:r>
+          </w:p>
+        </w:tc>
+        <w:tc>
+          <w:tcPr>
+            <w:tcW w:w="1600" w:type="dxa"/>
+            <w:tcMar>
+              <w:top w:w="80" w:type="dxa"/>
+              <w:left w:w="100" w:type="dxa"/>
+              <w:bottom w:w="80" w:type="dxa"/>
+              <w:right w:w="100" w:type="dxa"/>
+            </w:tcMar>
+            <w:vAlign w:val="center"/>
+          </w:tcPr>
+          <w:p>
+            <w:r>
+              <w:rPr>
+                <w:sz w:val="21"/>
+                <w:szCs w:val="21"/>
+              </w:rPr>
+              <w:t xml:space="preserve">NVA</w:t>
+            </w:r>
+          </w:p>
+        </w:tc>
+      </w:tr>
+      <w:tr>
+        <w:tc>
+          <w:tcPr>
+            <w:tcW w:w="4700" w:type="dxa"/>
+            <w:tcMar>
+              <w:top w:w="80" w:type="dxa"/>
+              <w:left w:w="100" w:type="dxa"/>
+              <w:bottom w:w="80" w:type="dxa"/>
+              <w:right w:w="100" w:type="dxa"/>
+            </w:tcMar>
+            <w:vAlign w:val="center"/>
+          </w:tcPr>
+          <w:p>
+            <w:r>
+              <w:rPr>
+                <w:sz w:val="21"/>
+                <w:szCs w:val="21"/>
+              </w:rPr>
+              <w:t xml:space="preserve">Chờ giờ cắt chuyến hoặc chờ phương tiện</w:t>
+            </w:r>
+          </w:p>
+        </w:tc>
+        <w:tc>
+          <w:tcPr>
+            <w:tcW w:w="2700" w:type="dxa"/>
+            <w:tcMar>
+              <w:top w:w="80" w:type="dxa"/>
+              <w:left w:w="100" w:type="dxa"/>
+              <w:bottom w:w="80" w:type="dxa"/>
+              <w:right w:w="100" w:type="dxa"/>
+            </w:tcMar>
+            <w:vAlign w:val="center"/>
+          </w:tcPr>
+          <w:p>
+            <w:r>
+              <w:rPr>
+                <w:sz w:val="21"/>
+                <w:szCs w:val="21"/>
+              </w:rPr>
+              <w:t xml:space="preserve">Outbound</w:t>
+            </w:r>
+          </w:p>
+        </w:tc>
+        <w:tc>
+          <w:tcPr>
+            <w:tcW w:w="1600" w:type="dxa"/>
+            <w:tcMar>
+              <w:top w:w="80" w:type="dxa"/>
+              <w:left w:w="100" w:type="dxa"/>
+              <w:bottom w:w="80" w:type="dxa"/>
+              <w:right w:w="100" w:type="dxa"/>
+            </w:tcMar>
+            <w:vAlign w:val="center"/>
+          </w:tcPr>
+          <w:p>
+            <w:r>
+              <w:rPr>
+                <w:sz w:val="21"/>
+                <w:szCs w:val="21"/>
+              </w:rPr>
+              <w:t xml:space="preserve">NVA</w:t>
+            </w:r>
+          </w:p>
+        </w:tc>
+      </w:tr>
+      <w:tr>
+        <w:tc>
+          <w:tcPr>
+            <w:tcW w:w="4700" w:type="dxa"/>
+            <w:tcMar>
+              <w:top w:w="80" w:type="dxa"/>
+              <w:left w:w="100" w:type="dxa"/>
+              <w:bottom w:w="80" w:type="dxa"/>
+              <w:right w:w="100" w:type="dxa"/>
+            </w:tcMar>
+            <w:vAlign w:val="center"/>
+          </w:tcPr>
+          <w:p>
+            <w:r>
+              <w:rPr>
+                <w:sz w:val="21"/>
+                <w:szCs w:val="21"/>
+              </w:rPr>
+              <w:t xml:space="preserve">Đóng bao/container và liên kết kiện với tuyến</w:t>
+            </w:r>
+          </w:p>
+        </w:tc>
+        <w:tc>
+          <w:tcPr>
+            <w:tcW w:w="2700" w:type="dxa"/>
+            <w:tcMar>
+              <w:top w:w="80" w:type="dxa"/>
+              <w:left w:w="100" w:type="dxa"/>
+              <w:bottom w:w="80" w:type="dxa"/>
+              <w:right w:w="100" w:type="dxa"/>
+            </w:tcMar>
+            <w:vAlign w:val="center"/>
+          </w:tcPr>
+          <w:p>
+            <w:r>
+              <w:rPr>
+                <w:sz w:val="21"/>
+                <w:szCs w:val="21"/>
+              </w:rPr>
+              <w:t xml:space="preserve">Outbound</w:t>
+            </w:r>
+          </w:p>
+        </w:tc>
+        <w:tc>
+          <w:tcPr>
+            <w:tcW w:w="1600" w:type="dxa"/>
+            <w:tcMar>
+              <w:top w:w="80" w:type="dxa"/>
+              <w:left w:w="100" w:type="dxa"/>
+              <w:bottom w:w="80" w:type="dxa"/>
+              <w:right w:w="100" w:type="dxa"/>
+            </w:tcMar>
+            <w:vAlign w:val="center"/>
+          </w:tcPr>
+          <w:p>
+            <w:r>
+              <w:rPr>
+                <w:sz w:val="21"/>
+                <w:szCs w:val="21"/>
+              </w:rPr>
+              <w:t xml:space="preserve">VA</w:t>
+            </w:r>
+          </w:p>
+        </w:tc>
+      </w:tr>
+      <w:tr>
+        <w:tc>
+          <w:tcPr>
+            <w:tcW w:w="4700" w:type="dxa"/>
+            <w:tcMar>
+              <w:top w:w="80" w:type="dxa"/>
+              <w:left w:w="100" w:type="dxa"/>
+              <w:bottom w:w="80" w:type="dxa"/>
+              <w:right w:w="100" w:type="dxa"/>
+            </w:tcMar>
+            <w:vAlign w:val="center"/>
+          </w:tcPr>
+          <w:p>
+            <w:r>
+              <w:rPr>
+                <w:sz w:val="21"/>
+                <w:szCs w:val="21"/>
+              </w:rPr>
+              <w:t xml:space="preserve">Đối soát, niêm phong và đóng manifest</w:t>
+            </w:r>
+          </w:p>
+        </w:tc>
+        <w:tc>
+          <w:tcPr>
+            <w:tcW w:w="2700" w:type="dxa"/>
+            <w:tcMar>
+              <w:top w:w="80" w:type="dxa"/>
+              <w:left w:w="100" w:type="dxa"/>
+              <w:bottom w:w="80" w:type="dxa"/>
+              <w:right w:w="100" w:type="dxa"/>
+            </w:tcMar>
+            <w:vAlign w:val="center"/>
+          </w:tcPr>
+          <w:p>
+            <w:r>
+              <w:rPr>
+                <w:sz w:val="21"/>
+                <w:szCs w:val="21"/>
+              </w:rPr>
+              <w:t xml:space="preserve">Outbound</w:t>
+            </w:r>
+          </w:p>
+        </w:tc>
+        <w:tc>
+          <w:tcPr>
+            <w:tcW w:w="1600" w:type="dxa"/>
+            <w:tcMar>
+              <w:top w:w="80" w:type="dxa"/>
+              <w:left w:w="100" w:type="dxa"/>
+              <w:bottom w:w="80" w:type="dxa"/>
+              <w:right w:w="100" w:type="dxa"/>
+            </w:tcMar>
+            <w:vAlign w:val="center"/>
+          </w:tcPr>
+          <w:p>
+            <w:r>
+              <w:rPr>
+                <w:sz w:val="21"/>
+                <w:szCs w:val="21"/>
+              </w:rPr>
+              <w:t xml:space="preserve">BVA</w:t>
+            </w:r>
+          </w:p>
+        </w:tc>
+      </w:tr>
+      <w:tr>
+        <w:tc>
+          <w:tcPr>
+            <w:tcW w:w="4700" w:type="dxa"/>
+            <w:tcMar>
+              <w:top w:w="80" w:type="dxa"/>
+              <w:left w:w="100" w:type="dxa"/>
+              <w:bottom w:w="80" w:type="dxa"/>
+              <w:right w:w="100" w:type="dxa"/>
+            </w:tcMar>
+            <w:vAlign w:val="center"/>
+          </w:tcPr>
+          <w:p>
+            <w:r>
+              <w:rPr>
+                <w:sz w:val="21"/>
+                <w:szCs w:val="21"/>
+              </w:rPr>
+              <w:t xml:space="preserve">Xếp xe, ký nhận và cập nhật trạng thái</w:t>
+            </w:r>
+          </w:p>
+        </w:tc>
+        <w:tc>
+          <w:tcPr>
+            <w:tcW w:w="2700" w:type="dxa"/>
+            <w:tcMar>
+              <w:top w:w="80" w:type="dxa"/>
+              <w:left w:w="100" w:type="dxa"/>
+              <w:bottom w:w="80" w:type="dxa"/>
+              <w:right w:w="100" w:type="dxa"/>
+            </w:tcMar>
+            <w:vAlign w:val="center"/>
+          </w:tcPr>
+          <w:p>
+            <w:r>
+              <w:rPr>
+                <w:sz w:val="21"/>
+                <w:szCs w:val="21"/>
+              </w:rPr>
+              <w:t xml:space="preserve">Outbound / vận tải</w:t>
+            </w:r>
+          </w:p>
+        </w:tc>
+        <w:tc>
+          <w:tcPr>
+            <w:tcW w:w="1600" w:type="dxa"/>
+            <w:tcMar>
+              <w:top w:w="80" w:type="dxa"/>
+              <w:left w:w="100" w:type="dxa"/>
+              <w:bottom w:w="80" w:type="dxa"/>
+              <w:right w:w="100" w:type="dxa"/>
+            </w:tcMar>
+            <w:vAlign w:val="center"/>
+          </w:tcPr>
+          <w:p>
+            <w:r>
+              <w:rPr>
+                <w:sz w:val="21"/>
+                <w:szCs w:val="21"/>
+              </w:rPr>
+              <w:t xml:space="preserve">BVA</w:t>
+            </w:r>
+          </w:p>
+        </w:tc>
+      </w:tr>
+    </w:tbl>
+    <w:p>
+      <w:pPr>
+        <w:spacing w:after="120"/>
+      </w:pPr>
+      <w:r>
+        <w:t xml:space="preserve"/>
       </w:r>
     </w:p>
     <w:p>
@@ -8471,7 +8347,7 @@
         </w:rPr>
         <w:drawing>
           <wp:inline distT="0" distB="0" distL="0" distR="0">
-            <wp:extent cx="5669280" cy="5469187"/>
+            <wp:extent cx="5120640" cy="8433995"/>
             <wp:effectExtent l="0" t="0" r="0" b="0"/>
             <wp:docPr id="103" name="Picture 103"/>
             <wp:cNvGraphicFramePr>
@@ -8496,7 +8372,7 @@
                   <pic:spPr bwMode="auto">
                     <a:xfrm>
                       <a:off x="0" y="0"/>
-                      <a:ext cx="5669280" cy="5469187"/>
+                      <a:ext cx="5120640" cy="8433995"/>
                     </a:xfrm>
                     <a:prstGeom prst="rect">
                       <a:avLst/>
@@ -8519,69 +8395,7 @@
           <w:i/>
           <w:iCs/>
         </w:rPr>
-        <w:t xml:space="preserve">Hình (e). Định lượng thời gian - giai đoạn tiếp nhận, kiểm tra và chia chọn</w:t>
-      </w:r>
-    </w:p>
-    <w:p>
-      <w:pPr>
-        <w:spacing w:before="120" w:after="160"/>
-        <w:jc w:val="center"/>
-      </w:pPr>
-      <w:r>
-        <w:rPr>
-          <w:noProof/>
-        </w:rPr>
-        <w:drawing>
-          <wp:inline distT="0" distB="0" distL="0" distR="0">
-            <wp:extent cx="5669280" cy="4051867"/>
-            <wp:effectExtent l="0" t="0" r="0" b="0"/>
-            <wp:docPr id="104" name="Picture 104"/>
-            <wp:cNvGraphicFramePr>
-              <a:graphicFrameLocks xmlns:a="http://schemas.openxmlformats.org/drawingml/2006/main" noChangeAspect="1"/>
-            </wp:cNvGraphicFramePr>
-            <a:graphic xmlns:a="http://schemas.openxmlformats.org/drawingml/2006/main">
-              <a:graphicData uri="http://schemas.openxmlformats.org/drawingml/2006/picture">
-                <pic:pic xmlns:pic="http://schemas.openxmlformats.org/drawingml/2006/picture">
-                  <pic:nvPicPr>
-                    <pic:cNvPr id="0" name=""/>
-                    <pic:cNvPicPr>
-                      <a:picLocks noChangeAspect="1" noChangeArrowheads="1"/>
-                    </pic:cNvPicPr>
-                  </pic:nvPicPr>
-                  <pic:blipFill>
-                    <a:blip r:embed="rId104"/>
-                    <a:srcRect/>
-                    <a:stretch>
-                      <a:fillRect/>
-                    </a:stretch>
-                  </pic:blipFill>
-                  <pic:spPr bwMode="auto">
-                    <a:xfrm>
-                      <a:off x="0" y="0"/>
-                      <a:ext cx="5669280" cy="4051867"/>
-                    </a:xfrm>
-                    <a:prstGeom prst="rect">
-                      <a:avLst/>
-                    </a:prstGeom>
-                  </pic:spPr>
-                </pic:pic>
-              </a:graphicData>
-            </a:graphic>
-          </wp:inline>
-        </w:drawing>
-      </w:r>
-    </w:p>
-    <w:p>
-      <w:pPr>
-        <w:spacing w:after="80"/>
-        <w:jc w:val="center"/>
-      </w:pPr>
-      <w:r>
-        <w:rPr>
-          <w:i/>
-          <w:iCs/>
-        </w:rPr>
-        <w:t xml:space="preserve">Hình (f). Định lượng thời gian - giai đoạn tập kết, đóng bao và bàn giao</w:t>
+        <w:t xml:space="preserve">Hình (e). Sơ đồ BPMN định lượng thời gian và xác suất</w:t>
       </w:r>
     </w:p>
     <w:p>

</xml_diff>